<commit_message>
Extract participant counts into activity form defaults
</commit_message>
<xml_diff>
--- a/docs/templates/ai-activity/开放原子开源社团PU活动申请书-模板.docx
+++ b/docs/templates/ai-activity/开放原子开源社团PU活动申请书-模板.docx
@@ -77,23 +77,6 @@
         </w:rPr>
         <w:t>活动名称：【{{clubName}}】{{activityName}}</w:t>
       </w:r>
-      <w:r>
-        <w:rPr>
-          <w:rFonts w:ascii="宋体" w:hAnsi="宋体" w:eastAsia="宋体" w:cs="宋体"/>
-          <w:sz w:val="21"/>
-          <w:szCs w:val="21"/>
-        </w:rPr>
-      </w:r>
-      <w:r>
-        <w:rPr>
-          <w:rFonts w:hint="eastAsia" w:ascii="宋体" w:hAnsi="宋体" w:eastAsia="宋体" w:cs="宋体"/>
-          <w:color w:val="000000"/>
-          <w:kern w:val="0"/>
-          <w:sz w:val="21"/>
-          <w:szCs w:val="21"/>
-          <w:lang w:val="en-US" w:eastAsia="zh-CN" w:bidi="ar"/>
-        </w:rPr>
-      </w:r>
     </w:p>
     <w:p>
       <w:pPr>
@@ -128,16 +111,6 @@
         </w:rPr>
         <w:t>活动简介：{{activitySummary}}</w:t>
       </w:r>
-      <w:r>
-        <w:rPr>
-          <w:rFonts w:hint="eastAsia" w:ascii="宋体" w:hAnsi="宋体" w:eastAsia="宋体" w:cs="宋体"/>
-          <w:color w:val="000000"/>
-          <w:kern w:val="0"/>
-          <w:sz w:val="21"/>
-          <w:szCs w:val="21"/>
-          <w:lang w:val="en-US" w:eastAsia="zh-CN" w:bidi="ar"/>
-        </w:rPr>
-      </w:r>
     </w:p>
     <w:p>
       <w:pPr>
@@ -174,8 +147,6 @@
         </w:rPr>
         <w:t>{{activityIntroduction}}</w:t>
       </w:r>
-      <w:bookmarkStart w:id="0" w:name="_GoBack"/>
-      <w:bookmarkEnd w:id="0"/>
     </w:p>
     <w:p>
       <w:pPr>
@@ -228,12 +199,6 @@
         </w:rPr>
         <w:t>活动申请部门：{{clubName}}</w:t>
       </w:r>
-      <w:r>
-        <w:rPr>
-          <w:rFonts w:hint="eastAsia" w:ascii="Calibri" w:hAnsi="Calibri" w:eastAsia="宋体"/>
-          <w:szCs w:val="22"/>
-        </w:rPr>
-      </w:r>
     </w:p>
     <w:p>
       <w:pPr>
@@ -252,35 +217,41 @@
         </w:rPr>
         <w:t>分类：{{activityCategory}}</w:t>
       </w:r>
-      <w:r>
-        <w:rPr>
-          <w:rFonts w:hint="eastAsia" w:ascii="Calibri" w:hAnsi="Calibri" w:eastAsia="宋体"/>
+    </w:p>
+    <w:p>
+      <w:pPr>
+        <w:rPr>
+          <w:rFonts w:hint="eastAsia" w:ascii="Calibri" w:hAnsi="Calibri" w:eastAsia="宋体"/>
+          <w:szCs w:val="22"/>
+        </w:rPr>
+      </w:pPr>
+      <w:r>
+        <w:rPr>
+          <w:rFonts w:hint="eastAsia" w:ascii="Calibri" w:hAnsi="Calibri" w:eastAsia="宋体"/>
+          <w:b/>
+          <w:bCs/>
+          <w:szCs w:val="22"/>
+        </w:rPr>
+        <w:t>活动级别：{{activityLevel}}</w:t>
+      </w:r>
+    </w:p>
+    <w:p>
+      <w:pPr>
+        <w:rPr>
+          <w:rFonts w:hint="default" w:ascii="Calibri" w:hAnsi="Calibri" w:eastAsia="宋体"/>
           <w:szCs w:val="22"/>
           <w:lang w:val="en-US" w:eastAsia="zh-CN"/>
         </w:rPr>
-      </w:r>
-    </w:p>
-    <w:p>
-      <w:pPr>
-        <w:rPr>
-          <w:rFonts w:hint="eastAsia" w:ascii="Calibri" w:hAnsi="Calibri" w:eastAsia="宋体"/>
-          <w:szCs w:val="22"/>
-        </w:rPr>
-      </w:pPr>
-      <w:r>
-        <w:rPr>
-          <w:rFonts w:hint="eastAsia" w:ascii="Calibri" w:hAnsi="Calibri" w:eastAsia="宋体"/>
-          <w:b/>
-          <w:bCs/>
-          <w:szCs w:val="22"/>
-        </w:rPr>
-        <w:t>活动级别：{{activityLevel}}</w:t>
-      </w:r>
-      <w:r>
-        <w:rPr>
-          <w:rFonts w:hint="eastAsia" w:ascii="Calibri" w:hAnsi="Calibri" w:eastAsia="宋体"/>
-          <w:szCs w:val="22"/>
-        </w:rPr>
+      </w:pPr>
+      <w:r>
+        <w:rPr>
+          <w:rFonts w:hint="eastAsia" w:ascii="Calibri" w:hAnsi="Calibri" w:eastAsia="宋体"/>
+          <w:b/>
+          <w:bCs/>
+          <w:szCs w:val="22"/>
+          <w:lang w:eastAsia="zh-CN"/>
+        </w:rPr>
+        <w:t>活动时间：{{activityDateRange}}</w:t>
       </w:r>
     </w:p>
     <w:p>
@@ -299,308 +270,7 @@
           <w:szCs w:val="22"/>
           <w:lang w:eastAsia="zh-CN"/>
         </w:rPr>
-        <w:t>活动时间：{{activityDateRange}}</w:t>
-      </w:r>
-      <w:r>
-        <w:rPr>
-          <w:rFonts w:hint="eastAsia" w:ascii="Calibri" w:hAnsi="Calibri" w:eastAsia="宋体"/>
-          <w:b/>
-          <w:bCs/>
-          <w:szCs w:val="22"/>
-          <w:lang w:val="en-US" w:eastAsia="zh-CN"/>
-        </w:rPr>
-      </w:r>
-      <w:r>
-        <w:rPr>
-          <w:rFonts w:hint="eastAsia" w:ascii="Calibri" w:hAnsi="Calibri" w:eastAsia="宋体"/>
-          <w:szCs w:val="22"/>
-          <w:lang w:eastAsia="zh-CN"/>
-        </w:rPr>
-      </w:r>
-      <w:r>
-        <w:rPr>
-          <w:rFonts w:hint="eastAsia" w:ascii="Calibri" w:hAnsi="Calibri" w:eastAsia="宋体"/>
-          <w:szCs w:val="22"/>
-          <w:lang w:val="en-US" w:eastAsia="zh-CN"/>
-        </w:rPr>
-      </w:r>
-      <w:r>
-        <w:rPr>
-          <w:rFonts w:hint="eastAsia" w:ascii="Calibri" w:hAnsi="Calibri" w:eastAsia="宋体"/>
-          <w:szCs w:val="22"/>
-          <w:lang w:eastAsia="zh-CN"/>
-        </w:rPr>
-      </w:r>
-      <w:r>
-        <w:rPr>
-          <w:rFonts w:hint="eastAsia" w:ascii="Calibri" w:hAnsi="Calibri" w:eastAsia="宋体"/>
-          <w:szCs w:val="22"/>
-          <w:lang w:val="en-US" w:eastAsia="zh-CN"/>
-        </w:rPr>
-      </w:r>
-      <w:r>
-        <w:rPr>
-          <w:rFonts w:hint="eastAsia" w:ascii="Calibri" w:hAnsi="Calibri" w:eastAsia="宋体"/>
-          <w:szCs w:val="22"/>
-          <w:lang w:eastAsia="zh-CN"/>
-        </w:rPr>
-      </w:r>
-      <w:r>
-        <w:rPr>
-          <w:rFonts w:hint="eastAsia" w:ascii="Calibri" w:hAnsi="Calibri" w:eastAsia="宋体"/>
-          <w:szCs w:val="22"/>
-          <w:lang w:val="en-US" w:eastAsia="zh-CN"/>
-        </w:rPr>
-      </w:r>
-      <w:r>
-        <w:rPr>
-          <w:rFonts w:hint="eastAsia" w:ascii="Calibri" w:hAnsi="Calibri" w:eastAsia="宋体"/>
-          <w:szCs w:val="22"/>
-          <w:lang w:eastAsia="zh-CN"/>
-        </w:rPr>
-      </w:r>
-      <w:r>
-        <w:rPr>
-          <w:rFonts w:hint="eastAsia" w:ascii="Calibri" w:hAnsi="Calibri" w:eastAsia="宋体"/>
-          <w:szCs w:val="22"/>
-          <w:lang w:val="en-US" w:eastAsia="zh-CN"/>
-        </w:rPr>
-      </w:r>
-      <w:r>
-        <w:rPr>
-          <w:rFonts w:hint="eastAsia" w:ascii="Calibri" w:hAnsi="Calibri" w:eastAsia="宋体"/>
-          <w:szCs w:val="22"/>
-          <w:lang w:eastAsia="zh-CN"/>
-        </w:rPr>
-      </w:r>
-      <w:r>
-        <w:rPr>
-          <w:rFonts w:hint="eastAsia" w:ascii="Calibri" w:hAnsi="Calibri" w:eastAsia="宋体"/>
-          <w:szCs w:val="22"/>
-          <w:lang w:val="en-US" w:eastAsia="zh-CN"/>
-        </w:rPr>
-      </w:r>
-      <w:r>
-        <w:rPr>
-          <w:rFonts w:hint="eastAsia" w:ascii="Calibri" w:hAnsi="Calibri" w:eastAsia="宋体"/>
-          <w:szCs w:val="22"/>
-          <w:lang w:eastAsia="zh-CN"/>
-        </w:rPr>
-      </w:r>
-      <w:r>
-        <w:rPr>
-          <w:rFonts w:hint="eastAsia" w:ascii="Calibri" w:hAnsi="Calibri" w:eastAsia="宋体"/>
-          <w:szCs w:val="22"/>
-          <w:lang w:val="en-US" w:eastAsia="zh-CN"/>
-        </w:rPr>
-      </w:r>
-      <w:r>
-        <w:rPr>
-          <w:rFonts w:hint="eastAsia" w:ascii="Calibri" w:hAnsi="Calibri" w:eastAsia="宋体"/>
-          <w:szCs w:val="22"/>
-          <w:lang w:eastAsia="zh-CN"/>
-        </w:rPr>
-      </w:r>
-      <w:r>
-        <w:rPr>
-          <w:rFonts w:hint="eastAsia" w:ascii="Calibri" w:hAnsi="Calibri" w:eastAsia="宋体"/>
-          <w:szCs w:val="22"/>
-          <w:lang w:val="en-US" w:eastAsia="zh-CN"/>
-        </w:rPr>
-      </w:r>
-      <w:r>
-        <w:rPr>
-          <w:rFonts w:hint="eastAsia" w:ascii="Calibri" w:hAnsi="Calibri" w:eastAsia="宋体"/>
-          <w:szCs w:val="22"/>
-          <w:lang w:eastAsia="zh-CN"/>
-        </w:rPr>
-      </w:r>
-      <w:r>
-        <w:rPr>
-          <w:rFonts w:hint="eastAsia" w:ascii="Calibri" w:hAnsi="Calibri" w:eastAsia="宋体"/>
-          <w:szCs w:val="22"/>
-          <w:lang w:val="en-US" w:eastAsia="zh-CN"/>
-        </w:rPr>
-      </w:r>
-      <w:r>
-        <w:rPr>
-          <w:rFonts w:hint="eastAsia" w:ascii="Calibri" w:hAnsi="Calibri" w:eastAsia="宋体"/>
-          <w:szCs w:val="22"/>
-          <w:lang w:eastAsia="zh-CN"/>
-        </w:rPr>
-      </w:r>
-      <w:r>
-        <w:rPr>
-          <w:rFonts w:hint="eastAsia" w:ascii="Calibri" w:hAnsi="Calibri" w:eastAsia="宋体"/>
-          <w:szCs w:val="22"/>
-          <w:lang w:val="en-US" w:eastAsia="zh-CN"/>
-        </w:rPr>
-      </w:r>
-      <w:r>
-        <w:rPr>
-          <w:rFonts w:hint="eastAsia" w:ascii="Calibri" w:hAnsi="Calibri" w:eastAsia="宋体"/>
-          <w:szCs w:val="22"/>
-          <w:lang w:val="en-US" w:eastAsia="zh-CN"/>
-        </w:rPr>
-      </w:r>
-    </w:p>
-    <w:p>
-      <w:pPr>
-        <w:rPr>
-          <w:rFonts w:hint="default" w:ascii="Calibri" w:hAnsi="Calibri" w:eastAsia="宋体"/>
-          <w:szCs w:val="22"/>
-          <w:lang w:val="en-US" w:eastAsia="zh-CN"/>
-        </w:rPr>
-      </w:pPr>
-      <w:r>
-        <w:rPr>
-          <w:rFonts w:hint="eastAsia" w:ascii="Calibri" w:hAnsi="Calibri" w:eastAsia="宋体"/>
-          <w:b/>
-          <w:bCs/>
-          <w:szCs w:val="22"/>
-          <w:lang w:eastAsia="zh-CN"/>
-        </w:rPr>
         <w:t>报名起止时间：{{registrationDateRange}}</w:t>
-      </w:r>
-      <w:r>
-        <w:rPr>
-          <w:rFonts w:hint="eastAsia" w:ascii="Calibri" w:hAnsi="Calibri" w:eastAsia="宋体"/>
-          <w:szCs w:val="22"/>
-          <w:lang w:eastAsia="zh-CN"/>
-        </w:rPr>
-      </w:r>
-      <w:r>
-        <w:rPr>
-          <w:rFonts w:hint="eastAsia" w:ascii="Calibri" w:hAnsi="Calibri" w:eastAsia="宋体"/>
-          <w:szCs w:val="22"/>
-          <w:lang w:val="en-US" w:eastAsia="zh-CN"/>
-        </w:rPr>
-      </w:r>
-      <w:r>
-        <w:rPr>
-          <w:rFonts w:hint="eastAsia" w:ascii="Calibri" w:hAnsi="Calibri" w:eastAsia="宋体"/>
-          <w:szCs w:val="22"/>
-          <w:lang w:eastAsia="zh-CN"/>
-        </w:rPr>
-      </w:r>
-      <w:r>
-        <w:rPr>
-          <w:rFonts w:hint="eastAsia" w:ascii="Calibri" w:hAnsi="Calibri" w:eastAsia="宋体"/>
-          <w:szCs w:val="22"/>
-          <w:lang w:val="en-US" w:eastAsia="zh-CN"/>
-        </w:rPr>
-      </w:r>
-      <w:r>
-        <w:rPr>
-          <w:rFonts w:hint="eastAsia" w:ascii="Calibri" w:hAnsi="Calibri" w:eastAsia="宋体"/>
-          <w:szCs w:val="22"/>
-          <w:lang w:eastAsia="zh-CN"/>
-        </w:rPr>
-      </w:r>
-      <w:r>
-        <w:rPr>
-          <w:rFonts w:hint="eastAsia" w:ascii="Calibri" w:hAnsi="Calibri" w:eastAsia="宋体"/>
-          <w:szCs w:val="22"/>
-          <w:lang w:val="en-US" w:eastAsia="zh-CN"/>
-        </w:rPr>
-      </w:r>
-      <w:r>
-        <w:rPr>
-          <w:rFonts w:hint="eastAsia" w:ascii="Calibri" w:hAnsi="Calibri" w:eastAsia="宋体"/>
-          <w:szCs w:val="22"/>
-          <w:lang w:eastAsia="zh-CN"/>
-        </w:rPr>
-      </w:r>
-      <w:r>
-        <w:rPr>
-          <w:rFonts w:hint="eastAsia" w:ascii="Calibri" w:hAnsi="Calibri" w:eastAsia="宋体"/>
-          <w:szCs w:val="22"/>
-          <w:lang w:val="en-US" w:eastAsia="zh-CN"/>
-        </w:rPr>
-      </w:r>
-      <w:r>
-        <w:rPr>
-          <w:rFonts w:hint="eastAsia" w:ascii="Calibri" w:hAnsi="Calibri" w:eastAsia="宋体"/>
-          <w:szCs w:val="22"/>
-          <w:lang w:eastAsia="zh-CN"/>
-        </w:rPr>
-      </w:r>
-      <w:r>
-        <w:rPr>
-          <w:rFonts w:hint="eastAsia" w:ascii="Calibri" w:hAnsi="Calibri" w:eastAsia="宋体"/>
-          <w:szCs w:val="22"/>
-          <w:lang w:val="en-US" w:eastAsia="zh-CN"/>
-        </w:rPr>
-      </w:r>
-      <w:r>
-        <w:rPr>
-          <w:rFonts w:hint="eastAsia" w:ascii="Calibri" w:hAnsi="Calibri" w:eastAsia="宋体"/>
-          <w:szCs w:val="22"/>
-          <w:lang w:eastAsia="zh-CN"/>
-        </w:rPr>
-      </w:r>
-      <w:r>
-        <w:rPr>
-          <w:rFonts w:hint="eastAsia" w:ascii="Calibri" w:hAnsi="Calibri" w:eastAsia="宋体"/>
-          <w:szCs w:val="22"/>
-          <w:lang w:val="en-US" w:eastAsia="zh-CN"/>
-        </w:rPr>
-      </w:r>
-      <w:r>
-        <w:rPr>
-          <w:rFonts w:hint="eastAsia" w:ascii="Calibri" w:hAnsi="Calibri" w:eastAsia="宋体"/>
-          <w:szCs w:val="22"/>
-          <w:lang w:eastAsia="zh-CN"/>
-        </w:rPr>
-      </w:r>
-      <w:r>
-        <w:rPr>
-          <w:rFonts w:hint="eastAsia" w:ascii="Calibri" w:hAnsi="Calibri" w:eastAsia="宋体"/>
-          <w:szCs w:val="22"/>
-          <w:lang w:val="en-US" w:eastAsia="zh-CN"/>
-        </w:rPr>
-      </w:r>
-      <w:r>
-        <w:rPr>
-          <w:rFonts w:hint="eastAsia" w:ascii="Calibri" w:hAnsi="Calibri" w:eastAsia="宋体"/>
-          <w:szCs w:val="22"/>
-          <w:lang w:eastAsia="zh-CN"/>
-        </w:rPr>
-      </w:r>
-      <w:r>
-        <w:rPr>
-          <w:rFonts w:hint="eastAsia" w:ascii="Calibri" w:hAnsi="Calibri" w:eastAsia="宋体"/>
-          <w:szCs w:val="22"/>
-          <w:lang w:val="en-US" w:eastAsia="zh-CN"/>
-        </w:rPr>
-      </w:r>
-      <w:r>
-        <w:rPr>
-          <w:rFonts w:hint="eastAsia" w:ascii="Calibri" w:hAnsi="Calibri" w:eastAsia="宋体"/>
-          <w:szCs w:val="22"/>
-          <w:lang w:eastAsia="zh-CN"/>
-        </w:rPr>
-      </w:r>
-      <w:r>
-        <w:rPr>
-          <w:rFonts w:hint="eastAsia" w:ascii="Calibri" w:hAnsi="Calibri" w:eastAsia="宋体"/>
-          <w:szCs w:val="22"/>
-          <w:lang w:val="en-US" w:eastAsia="zh-CN"/>
-        </w:rPr>
-      </w:r>
-      <w:r>
-        <w:rPr>
-          <w:rFonts w:hint="eastAsia" w:ascii="Calibri" w:hAnsi="Calibri" w:eastAsia="宋体"/>
-          <w:szCs w:val="22"/>
-          <w:lang w:eastAsia="zh-CN"/>
-        </w:rPr>
-      </w:r>
-      <w:r>
-        <w:rPr>
-          <w:rFonts w:hint="eastAsia" w:ascii="Calibri" w:hAnsi="Calibri" w:eastAsia="宋体"/>
-          <w:szCs w:val="22"/>
-          <w:lang w:val="en-US" w:eastAsia="zh-CN"/>
-        </w:rPr>
       </w:r>
     </w:p>
     <w:p>
@@ -622,130 +292,235 @@
         </w:rPr>
         <w:t>活动地点：{{location}}</w:t>
       </w:r>
-      <w:r>
-        <w:rPr>
-          <w:rFonts w:hint="eastAsia" w:asciiTheme="minorHAnsi" w:hAnsiTheme="minorHAnsi" w:eastAsiaTheme="minorEastAsia" w:cstheme="minorBidi"/>
-          <w:b w:val="0"/>
-          <w:bCs w:val="0"/>
+    </w:p>
+    <w:p>
+      <w:pPr>
+        <w:rPr>
+          <w:rFonts w:hint="eastAsia" w:ascii="Calibri" w:hAnsi="Calibri" w:eastAsia="宋体"/>
+          <w:szCs w:val="22"/>
+        </w:rPr>
+      </w:pPr>
+      <w:r>
+        <w:rPr>
+          <w:rFonts w:hint="eastAsia" w:ascii="Calibri" w:hAnsi="Calibri" w:eastAsia="宋体"/>
+          <w:b/>
+          <w:bCs/>
+          <w:szCs w:val="22"/>
+        </w:rPr>
+        <w:t>活动面向院系：{{targetCollege}}</w:t>
+      </w:r>
+    </w:p>
+    <w:p>
+      <w:pPr>
+        <w:rPr>
+          <w:rFonts w:hint="eastAsia" w:ascii="Calibri" w:hAnsi="Calibri" w:eastAsia="宋体"/>
+          <w:szCs w:val="22"/>
+        </w:rPr>
+      </w:pPr>
+      <w:r>
+        <w:rPr>
+          <w:rFonts w:hint="eastAsia" w:ascii="Calibri" w:hAnsi="Calibri" w:eastAsia="宋体"/>
+          <w:b/>
+          <w:bCs/>
+          <w:szCs w:val="22"/>
+        </w:rPr>
+        <w:t>活动面向年级：{{targetGrade}}</w:t>
+      </w:r>
+    </w:p>
+    <w:p>
+      <w:pPr>
+        <w:rPr>
+          <w:rFonts w:hint="eastAsia" w:ascii="Calibri" w:hAnsi="Calibri" w:eastAsia="宋体"/>
+          <w:szCs w:val="22"/>
+          <w:lang w:eastAsia="zh-CN"/>
+        </w:rPr>
+      </w:pPr>
+      <w:r>
+        <w:rPr>
+          <w:rFonts w:hint="eastAsia" w:ascii="Calibri" w:hAnsi="Calibri" w:eastAsia="宋体"/>
+          <w:b/>
+          <w:bCs/>
+          <w:szCs w:val="22"/>
+        </w:rPr>
+        <w:t>活动人数：{{expectedParticipants}} 人</w:t>
+      </w:r>
+    </w:p>
+    <w:p>
+      <w:pPr>
+        <w:rPr>
+          <w:rFonts w:hint="eastAsia" w:ascii="Calibri" w:hAnsi="Calibri" w:eastAsia="宋体"/>
+          <w:szCs w:val="22"/>
+        </w:rPr>
+      </w:pPr>
+      <w:r>
+        <w:rPr>
+          <w:rFonts w:hint="eastAsia" w:ascii="Calibri" w:hAnsi="Calibri" w:eastAsia="宋体"/>
+          <w:b/>
+          <w:bCs/>
+          <w:szCs w:val="22"/>
+        </w:rPr>
+        <w:t>可得实践学时：{{practiceHours}} 学时</w:t>
+      </w:r>
+    </w:p>
+    <w:p>
+      <w:pPr>
+        <w:rPr>
+          <w:rFonts w:hint="eastAsia" w:ascii="Calibri" w:hAnsi="Calibri" w:eastAsia="宋体"/>
+          <w:szCs w:val="22"/>
+        </w:rPr>
+      </w:pPr>
+      <w:r>
+        <w:rPr>
+          <w:rFonts w:hint="eastAsia" w:ascii="Calibri" w:hAnsi="Calibri" w:eastAsia="宋体"/>
+          <w:b/>
+          <w:bCs/>
+          <w:szCs w:val="22"/>
+          <w:lang w:eastAsia="zh-CN"/>
+        </w:rPr>
+        <w:t>是否需要签退：{{needCheckout}}</w:t>
+      </w:r>
+    </w:p>
+    <w:p>
+      <w:pPr>
+        <w:rPr>
+          <w:rFonts w:hint="eastAsia" w:ascii="Calibri" w:hAnsi="Calibri" w:eastAsia="宋体"/>
+          <w:szCs w:val="22"/>
+        </w:rPr>
+      </w:pPr>
+      <w:r>
+        <w:rPr>
+          <w:rFonts w:hint="eastAsia" w:ascii="Calibri" w:hAnsi="Calibri" w:eastAsia="宋体"/>
+          <w:b/>
+          <w:bCs/>
+          <w:szCs w:val="22"/>
+          <w:lang w:eastAsia="zh-CN"/>
+        </w:rPr>
+        <w:t>是否需要外勤打卡：{{needFieldCheckin}}</w:t>
+      </w:r>
+    </w:p>
+    <w:p>
+      <w:pPr>
+        <w:rPr>
+          <w:rFonts w:hint="eastAsia" w:ascii="Calibri" w:hAnsi="Calibri" w:eastAsia="宋体"/>
+          <w:szCs w:val="22"/>
+          <w:lang w:eastAsia="zh-CN"/>
+        </w:rPr>
+      </w:pPr>
+      <w:r>
+        <w:rPr>
+          <w:rFonts w:hint="eastAsia" w:ascii="Calibri" w:hAnsi="Calibri" w:eastAsia="宋体"/>
+          <w:b/>
+          <w:bCs/>
+          <w:szCs w:val="22"/>
+        </w:rPr>
+        <w:t>报名名额：{{registrationQuota}} 人</w:t>
+      </w:r>
+    </w:p>
+    <w:p>
+      <w:pPr>
+        <w:rPr>
+          <w:rFonts w:hint="eastAsia" w:ascii="Calibri" w:hAnsi="Calibri" w:eastAsia="宋体"/>
+          <w:szCs w:val="22"/>
+        </w:rPr>
+      </w:pPr>
+      <w:r>
+        <w:rPr>
+          <w:rFonts w:hint="eastAsia" w:ascii="Calibri" w:hAnsi="Calibri" w:eastAsia="宋体"/>
+          <w:b/>
+          <w:bCs/>
+          <w:szCs w:val="22"/>
+        </w:rPr>
+        <w:t>联系方式：{{contactText}}</w:t>
+      </w:r>
+    </w:p>
+    <w:p>
+      <w:pPr>
+        <w:rPr>
+          <w:rFonts w:hint="eastAsia" w:ascii="Calibri" w:hAnsi="Calibri" w:eastAsia="宋体"/>
+          <w:szCs w:val="22"/>
+        </w:rPr>
+      </w:pPr>
+      <w:r>
+        <w:rPr>
+          <w:rFonts w:hint="eastAsia" w:ascii="Calibri" w:hAnsi="Calibri" w:eastAsia="宋体"/>
+          <w:b/>
+          <w:bCs/>
+          <w:szCs w:val="22"/>
+        </w:rPr>
+        <w:t>报名方式：{{registrationMethod}}</w:t>
+      </w:r>
+    </w:p>
+    <w:p>
+      <w:pPr>
+        <w:rPr>
+          <w:rFonts w:hint="default" w:ascii="Calibri" w:hAnsi="Calibri" w:eastAsia="宋体"/>
           <w:szCs w:val="22"/>
           <w:lang w:val="en-US" w:eastAsia="zh-CN"/>
         </w:rPr>
-      </w:r>
-      <w:r>
-        <w:rPr>
-          <w:rFonts w:hint="eastAsia" w:ascii="Calibri" w:hAnsi="Calibri" w:eastAsia="宋体"/>
+      </w:pPr>
+      <w:r>
+        <w:rPr>
+          <w:rFonts w:hint="eastAsia" w:ascii="Calibri" w:hAnsi="Calibri" w:eastAsia="宋体"/>
+          <w:b/>
+          <w:bCs/>
+          <w:szCs w:val="22"/>
+        </w:rPr>
+        <w:t>签到员学号：{{checkinStudentId}}</w:t>
+      </w:r>
+    </w:p>
+    <w:p>
+      <w:pPr>
+        <w:rPr>
+          <w:rFonts w:hint="eastAsia" w:ascii="Calibri" w:hAnsi="Calibri" w:eastAsia="宋体"/>
+          <w:b/>
+          <w:bCs/>
+          <w:szCs w:val="22"/>
+          <w:lang w:eastAsia="zh-CN"/>
+        </w:rPr>
+      </w:pPr>
+      <w:r>
+        <w:rPr>
+          <w:rFonts w:hint="eastAsia" w:ascii="Calibri" w:hAnsi="Calibri" w:eastAsia="宋体"/>
+          <w:b/>
+          <w:bCs/>
+          <w:szCs w:val="22"/>
+          <w:lang w:eastAsia="zh-CN"/>
+        </w:rPr>
+        <w:t>活动指导老师：{{advisorName}}</w:t>
+      </w:r>
+    </w:p>
+    <w:p>
+      <w:pPr>
+        <w:rPr>
+          <w:rFonts w:hint="eastAsia" w:ascii="Calibri" w:hAnsi="Calibri" w:eastAsia="宋体"/>
+          <w:b/>
+          <w:bCs/>
+          <w:szCs w:val="22"/>
+          <w:lang w:eastAsia="zh-CN"/>
+        </w:rPr>
+      </w:pPr>
+      <w:bookmarkStart w:id="0" w:name="_GoBack"/>
+      <w:bookmarkEnd w:id="0"/>
+    </w:p>
+    <w:p>
+      <w:pPr>
+        <w:rPr>
+          <w:rFonts w:hint="default" w:ascii="Calibri" w:hAnsi="Calibri" w:eastAsia="宋体"/>
           <w:b/>
           <w:bCs/>
           <w:szCs w:val="22"/>
           <w:lang w:val="en-US" w:eastAsia="zh-CN"/>
         </w:rPr>
-      </w:r>
-      <w:r>
-        <w:rPr>
-          <w:rFonts w:hint="eastAsia" w:ascii="Calibri" w:hAnsi="Calibri" w:eastAsia="宋体"/>
-          <w:b w:val="0"/>
-          <w:bCs w:val="0"/>
+      </w:pPr>
+      <w:r>
+        <w:rPr>
+          <w:rFonts w:hint="default" w:ascii="Calibri" w:hAnsi="Calibri" w:eastAsia="宋体"/>
+          <w:b/>
+          <w:bCs/>
           <w:szCs w:val="22"/>
           <w:lang w:val="en-US" w:eastAsia="zh-CN"/>
         </w:rPr>
-      </w:r>
-    </w:p>
-    <w:p>
-      <w:pPr>
-        <w:rPr>
-          <w:rFonts w:hint="eastAsia" w:ascii="Calibri" w:hAnsi="Calibri" w:eastAsia="宋体"/>
-          <w:szCs w:val="22"/>
-        </w:rPr>
-      </w:pPr>
-      <w:r>
-        <w:rPr>
-          <w:rFonts w:hint="eastAsia" w:ascii="Calibri" w:hAnsi="Calibri" w:eastAsia="宋体"/>
-          <w:b/>
-          <w:bCs/>
-          <w:szCs w:val="22"/>
-        </w:rPr>
-        <w:t>活动面向院系：{{targetCollege}}</w:t>
-      </w:r>
-      <w:r>
-        <w:rPr>
-          <w:rFonts w:hint="eastAsia" w:ascii="Calibri" w:hAnsi="Calibri" w:eastAsia="宋体"/>
-          <w:b/>
-          <w:bCs/>
-          <w:szCs w:val="22"/>
-          <w:lang w:eastAsia="zh-CN"/>
-        </w:rPr>
-      </w:r>
-      <w:r>
-        <w:rPr>
-          <w:rFonts w:hint="eastAsia" w:ascii="Calibri" w:hAnsi="Calibri" w:eastAsia="宋体"/>
-          <w:b/>
-          <w:bCs/>
-          <w:szCs w:val="22"/>
-        </w:rPr>
-      </w:r>
-      <w:r>
-        <w:rPr>
-          <w:rFonts w:hint="eastAsia" w:ascii="Calibri" w:hAnsi="Calibri" w:eastAsia="宋体"/>
-          <w:szCs w:val="22"/>
-        </w:rPr>
-      </w:r>
-    </w:p>
-    <w:p>
-      <w:pPr>
-        <w:rPr>
-          <w:rFonts w:hint="eastAsia" w:ascii="Calibri" w:hAnsi="Calibri" w:eastAsia="宋体"/>
-          <w:szCs w:val="22"/>
-        </w:rPr>
-      </w:pPr>
-      <w:r>
-        <w:rPr>
-          <w:rFonts w:hint="eastAsia" w:ascii="Calibri" w:hAnsi="Calibri" w:eastAsia="宋体"/>
-          <w:b/>
-          <w:bCs/>
-          <w:szCs w:val="22"/>
-        </w:rPr>
-        <w:t>活动面向年级：{{targetGrade}}</w:t>
-      </w:r>
-      <w:r>
-        <w:rPr>
-          <w:rFonts w:hint="eastAsia" w:ascii="Calibri" w:hAnsi="Calibri" w:eastAsia="宋体"/>
-          <w:b/>
-          <w:bCs/>
-          <w:szCs w:val="22"/>
-          <w:lang w:eastAsia="zh-CN"/>
-        </w:rPr>
-      </w:r>
-      <w:r>
-        <w:rPr>
-          <w:rFonts w:hint="eastAsia" w:ascii="Calibri" w:hAnsi="Calibri" w:eastAsia="宋体"/>
-          <w:b/>
-          <w:bCs/>
-          <w:szCs w:val="22"/>
-        </w:rPr>
-      </w:r>
-      <w:r>
-        <w:rPr>
-          <w:rFonts w:hint="eastAsia" w:ascii="Calibri" w:hAnsi="Calibri" w:eastAsia="宋体"/>
-          <w:szCs w:val="22"/>
-        </w:rPr>
-      </w:r>
-    </w:p>
-    <w:p>
-      <w:pPr>
-        <w:rPr>
-          <w:rFonts w:hint="eastAsia" w:ascii="Calibri" w:hAnsi="Calibri" w:eastAsia="宋体"/>
-          <w:szCs w:val="22"/>
-          <w:lang w:eastAsia="zh-CN"/>
-        </w:rPr>
-      </w:pPr>
-      <w:r>
-        <w:rPr>
-          <w:rFonts w:hint="eastAsia" w:ascii="Calibri" w:hAnsi="Calibri" w:eastAsia="宋体"/>
-          <w:b/>
-          <w:bCs/>
-          <w:szCs w:val="22"/>
-        </w:rPr>
-        <w:t>活动人数：{{expectedParticipants}} 人</w:t>
+        <w:t>{{</w:t>
       </w:r>
       <w:r>
         <w:rPr>
@@ -755,284 +530,17 @@
           <w:szCs w:val="22"/>
           <w:lang w:val="en-US" w:eastAsia="zh-CN"/>
         </w:rPr>
-      </w:r>
-      <w:r>
-        <w:rPr>
-          <w:rFonts w:hint="eastAsia" w:ascii="Calibri" w:hAnsi="Calibri" w:eastAsia="宋体"/>
+        <w:t>expectedParticipants</w:t>
+      </w:r>
+      <w:r>
+        <w:rPr>
+          <w:rFonts w:hint="default" w:ascii="Calibri" w:hAnsi="Calibri" w:eastAsia="宋体"/>
+          <w:b/>
+          <w:bCs/>
           <w:szCs w:val="22"/>
           <w:lang w:val="en-US" w:eastAsia="zh-CN"/>
         </w:rPr>
-      </w:r>
-      <w:r>
-        <w:rPr>
-          <w:rFonts w:hint="eastAsia" w:ascii="Calibri" w:hAnsi="Calibri" w:eastAsia="宋体"/>
-          <w:szCs w:val="22"/>
-          <w:lang w:eastAsia="zh-CN"/>
-        </w:rPr>
-      </w:r>
-    </w:p>
-    <w:p>
-      <w:pPr>
-        <w:rPr>
-          <w:rFonts w:hint="eastAsia" w:ascii="Calibri" w:hAnsi="Calibri" w:eastAsia="宋体"/>
-          <w:szCs w:val="22"/>
-        </w:rPr>
-      </w:pPr>
-      <w:r>
-        <w:rPr>
-          <w:rFonts w:hint="eastAsia" w:ascii="Calibri" w:hAnsi="Calibri" w:eastAsia="宋体"/>
-          <w:b/>
-          <w:bCs/>
-          <w:szCs w:val="22"/>
-        </w:rPr>
-        <w:t>可得实践学时：{{practiceHours}} 学时</w:t>
-      </w:r>
-      <w:r>
-        <w:rPr>
-          <w:rFonts w:hint="eastAsia" w:ascii="Calibri" w:hAnsi="Calibri" w:eastAsia="宋体"/>
-          <w:szCs w:val="22"/>
-        </w:rPr>
-      </w:r>
-      <w:r>
-        <w:rPr>
-          <w:rFonts w:hint="eastAsia" w:ascii="Calibri" w:hAnsi="Calibri" w:eastAsia="宋体"/>
-          <w:szCs w:val="22"/>
-          <w:lang w:eastAsia="zh-CN"/>
-        </w:rPr>
-      </w:r>
-      <w:r>
-        <w:rPr>
-          <w:rFonts w:hint="eastAsia" w:ascii="Calibri" w:hAnsi="Calibri" w:eastAsia="宋体"/>
-          <w:szCs w:val="22"/>
-        </w:rPr>
-      </w:r>
-    </w:p>
-    <w:p>
-      <w:pPr>
-        <w:rPr>
-          <w:rFonts w:hint="eastAsia" w:ascii="Calibri" w:hAnsi="Calibri" w:eastAsia="宋体"/>
-          <w:szCs w:val="22"/>
-        </w:rPr>
-      </w:pPr>
-      <w:r>
-        <w:rPr>
-          <w:rFonts w:hint="eastAsia" w:ascii="Calibri" w:hAnsi="Calibri" w:eastAsia="宋体"/>
-          <w:b/>
-          <w:bCs/>
-          <w:szCs w:val="22"/>
-          <w:lang w:eastAsia="zh-CN"/>
-        </w:rPr>
-        <w:t>是否需要签退：{{needCheckout}}</w:t>
-      </w:r>
-      <w:r>
-        <w:rPr>
-          <w:rFonts w:hint="eastAsia" w:ascii="Calibri" w:hAnsi="Calibri" w:eastAsia="宋体"/>
-          <w:b/>
-          <w:bCs/>
-          <w:szCs w:val="22"/>
-        </w:rPr>
-      </w:r>
-      <w:r>
-        <w:rPr>
-          <w:rFonts w:hint="eastAsia" w:ascii="Calibri" w:hAnsi="Calibri" w:eastAsia="宋体"/>
-          <w:szCs w:val="22"/>
-        </w:rPr>
-      </w:r>
-    </w:p>
-    <w:p>
-      <w:pPr>
-        <w:rPr>
-          <w:rFonts w:hint="eastAsia" w:ascii="Calibri" w:hAnsi="Calibri" w:eastAsia="宋体"/>
-          <w:szCs w:val="22"/>
-        </w:rPr>
-      </w:pPr>
-      <w:r>
-        <w:rPr>
-          <w:rFonts w:hint="eastAsia" w:ascii="Calibri" w:hAnsi="Calibri" w:eastAsia="宋体"/>
-          <w:b/>
-          <w:bCs/>
-          <w:szCs w:val="22"/>
-          <w:lang w:eastAsia="zh-CN"/>
-        </w:rPr>
-        <w:t>是否需要外勤打卡：{{needFieldCheckin}}</w:t>
-      </w:r>
-      <w:r>
-        <w:rPr>
-          <w:rFonts w:hint="eastAsia" w:ascii="Calibri" w:hAnsi="Calibri" w:eastAsia="宋体"/>
-          <w:b/>
-          <w:bCs/>
-          <w:szCs w:val="22"/>
-        </w:rPr>
-      </w:r>
-      <w:r>
-        <w:rPr>
-          <w:rFonts w:hint="eastAsia" w:ascii="Calibri" w:hAnsi="Calibri" w:eastAsia="宋体"/>
-          <w:szCs w:val="22"/>
-        </w:rPr>
-      </w:r>
-    </w:p>
-    <w:p>
-      <w:pPr>
-        <w:rPr>
-          <w:rFonts w:hint="eastAsia" w:ascii="Calibri" w:hAnsi="Calibri" w:eastAsia="宋体"/>
-          <w:szCs w:val="22"/>
-          <w:lang w:eastAsia="zh-CN"/>
-        </w:rPr>
-      </w:pPr>
-      <w:r>
-        <w:rPr>
-          <w:rFonts w:hint="eastAsia" w:ascii="Calibri" w:hAnsi="Calibri" w:eastAsia="宋体"/>
-          <w:b/>
-          <w:bCs/>
-          <w:szCs w:val="22"/>
-        </w:rPr>
-        <w:t>报名名额：{{registrationQuota}} 人</w:t>
-      </w:r>
-      <w:r>
-        <w:rPr>
-          <w:rFonts w:hint="eastAsia" w:ascii="Calibri" w:hAnsi="Calibri" w:eastAsia="宋体"/>
-          <w:b/>
-          <w:bCs/>
-          <w:szCs w:val="22"/>
-          <w:lang w:val="en-US" w:eastAsia="zh-CN"/>
-        </w:rPr>
-      </w:r>
-      <w:r>
-        <w:rPr>
-          <w:rFonts w:hint="eastAsia" w:ascii="Calibri" w:hAnsi="Calibri" w:eastAsia="宋体"/>
-          <w:szCs w:val="22"/>
-          <w:lang w:eastAsia="zh-CN"/>
-        </w:rPr>
-      </w:r>
-    </w:p>
-    <w:p>
-      <w:pPr>
-        <w:rPr>
-          <w:rFonts w:hint="eastAsia" w:ascii="Calibri" w:hAnsi="Calibri" w:eastAsia="宋体"/>
-          <w:szCs w:val="22"/>
-        </w:rPr>
-      </w:pPr>
-      <w:r>
-        <w:rPr>
-          <w:rFonts w:hint="eastAsia" w:ascii="Calibri" w:hAnsi="Calibri" w:eastAsia="宋体"/>
-          <w:b/>
-          <w:bCs/>
-          <w:szCs w:val="22"/>
-        </w:rPr>
-        <w:t>联系方式：{{contactText}}</w:t>
-      </w:r>
-      <w:r>
-        <w:rPr>
-          <w:rFonts w:hint="eastAsia" w:ascii="Calibri" w:hAnsi="Calibri" w:eastAsia="宋体"/>
-          <w:szCs w:val="22"/>
-        </w:rPr>
-      </w:r>
-      <w:r>
-        <w:rPr>
-          <w:rFonts w:hint="eastAsia" w:ascii="Calibri" w:hAnsi="Calibri" w:eastAsia="宋体"/>
-          <w:szCs w:val="22"/>
-          <w:lang w:eastAsia="zh-CN"/>
-        </w:rPr>
-      </w:r>
-      <w:r>
-        <w:rPr>
-          <w:rFonts w:hint="eastAsia" w:ascii="Calibri" w:hAnsi="Calibri" w:eastAsia="宋体"/>
-          <w:szCs w:val="22"/>
-        </w:rPr>
-      </w:r>
-    </w:p>
-    <w:p>
-      <w:pPr>
-        <w:rPr>
-          <w:rFonts w:hint="eastAsia" w:ascii="Calibri" w:hAnsi="Calibri" w:eastAsia="宋体"/>
-          <w:szCs w:val="22"/>
-        </w:rPr>
-      </w:pPr>
-      <w:r>
-        <w:rPr>
-          <w:rFonts w:hint="eastAsia" w:ascii="Calibri" w:hAnsi="Calibri" w:eastAsia="宋体"/>
-          <w:b/>
-          <w:bCs/>
-          <w:szCs w:val="22"/>
-        </w:rPr>
-        <w:t>报名方式：{{registrationMethod}}</w:t>
-      </w:r>
-      <w:r>
-        <w:rPr>
-          <w:rFonts w:hint="eastAsia" w:ascii="Calibri" w:hAnsi="Calibri" w:eastAsia="宋体"/>
-          <w:szCs w:val="22"/>
-        </w:rPr>
-      </w:r>
-      <w:r>
-        <w:rPr>
-          <w:rFonts w:hint="eastAsia" w:ascii="Calibri" w:hAnsi="Calibri" w:eastAsia="宋体"/>
-          <w:szCs w:val="22"/>
-          <w:lang w:val="en-US" w:eastAsia="zh-CN"/>
-        </w:rPr>
-      </w:r>
-      <w:r>
-        <w:rPr>
-          <w:rFonts w:hint="eastAsia" w:ascii="Calibri" w:hAnsi="Calibri" w:eastAsia="宋体"/>
-          <w:szCs w:val="22"/>
-          <w:lang w:eastAsia="zh-CN"/>
-        </w:rPr>
-      </w:r>
-      <w:r>
-        <w:rPr>
-          <w:rFonts w:hint="eastAsia" w:ascii="Calibri" w:hAnsi="Calibri" w:eastAsia="宋体"/>
-          <w:szCs w:val="22"/>
-        </w:rPr>
-      </w:r>
-    </w:p>
-    <w:p>
-      <w:pPr>
-        <w:rPr>
-          <w:rFonts w:hint="default" w:ascii="Calibri" w:hAnsi="Calibri" w:eastAsia="宋体"/>
-          <w:szCs w:val="22"/>
-          <w:lang w:val="en-US" w:eastAsia="zh-CN"/>
-        </w:rPr>
-      </w:pPr>
-      <w:r>
-        <w:rPr>
-          <w:rFonts w:hint="eastAsia" w:ascii="Calibri" w:hAnsi="Calibri" w:eastAsia="宋体"/>
-          <w:b/>
-          <w:bCs/>
-          <w:szCs w:val="22"/>
-        </w:rPr>
-        <w:t>签到员学号：{{checkinStudentId}}</w:t>
-      </w:r>
-      <w:r>
-        <w:rPr>
-          <w:rFonts w:hint="eastAsia" w:ascii="Calibri" w:hAnsi="Calibri" w:eastAsia="宋体"/>
-          <w:szCs w:val="22"/>
-          <w:lang w:val="en-US" w:eastAsia="zh-CN"/>
-        </w:rPr>
-      </w:r>
-    </w:p>
-    <w:p>
-      <w:pPr>
-        <w:rPr>
-          <w:rFonts w:hint="eastAsia" w:ascii="Calibri" w:hAnsi="Calibri" w:eastAsia="宋体"/>
-          <w:szCs w:val="22"/>
-          <w:lang w:eastAsia="zh-CN"/>
-        </w:rPr>
-      </w:pPr>
-      <w:r>
-        <w:rPr>
-          <w:rFonts w:hint="eastAsia" w:ascii="Calibri" w:hAnsi="Calibri" w:eastAsia="宋体"/>
-          <w:b/>
-          <w:bCs/>
-          <w:szCs w:val="22"/>
-          <w:lang w:eastAsia="zh-CN"/>
-        </w:rPr>
-        <w:t>活动指导老师：{{advisorName}}</w:t>
-      </w:r>
-      <w:r>
-        <w:rPr>
-          <w:rFonts w:hint="eastAsia" w:ascii="Calibri" w:hAnsi="Calibri" w:eastAsia="宋体"/>
-          <w:szCs w:val="22"/>
-          <w:lang w:eastAsia="zh-CN"/>
-        </w:rPr>
+        <w:t>}}</w:t>
       </w:r>
     </w:p>
     <w:p>

</xml_diff>